<commit_message>
docs: add team registration details to review report
</commit_message>
<xml_diff>
--- a/review/Compiler_Design_Project_Review_Report.docx
+++ b/review/Compiler_Design_Project_Review_Report.docx
@@ -19,7 +19,7 @@
     </w:p>
     <w:p>
       <w:pPr>
-        <w:spacing w:after="480"/>
+        <w:spacing w:after="320"/>
       </w:pPr>
       <w:r>
         <w:rPr>
@@ -32,51 +32,331 @@
         <w:t>Compiler Design Project Review Report</w:t>
       </w:r>
     </w:p>
+    <w:tbl>
+      <w:tblPr>
+        <w:tblW w:type="auto" w:w="0"/>
+        <w:jc w:val="center"/>
+        <w:tblLayout w:type="fixed"/>
+        <w:tblLook w:firstColumn="1" w:firstRow="1" w:lastColumn="0" w:lastRow="0" w:noHBand="0" w:noVBand="1" w:val="04A0"/>
+      </w:tblPr>
+      <w:tblGrid>
+        <w:gridCol w:w="4968"/>
+        <w:gridCol w:w="4968"/>
+      </w:tblGrid>
+      <w:tr>
+        <w:trPr>
+          <w:tblHeader w:val="true"/>
+          <w:cantSplit w:val="true"/>
+        </w:trPr>
+        <w:tc>
+          <w:tcPr>
+            <w:tcW w:type="dxa" w:w="4824"/>
+            <w:shd w:fill="17324D"/>
+            <w:tcBorders>
+              <w:top w:val="single" w:sz="6" w:color="D9D9D9"/>
+              <w:left w:val="single" w:sz="6" w:color="D9D9D9"/>
+              <w:bottom w:val="single" w:sz="6" w:color="D9D9D9"/>
+              <w:right w:val="single" w:sz="6" w:color="D9D9D9"/>
+              <w:insideH w:val="single" w:sz="6" w:color="D9D9D9"/>
+              <w:insideV w:val="single" w:sz="6" w:color="D9D9D9"/>
+            </w:tcBorders>
+            <w:tcMar>
+              <w:top w:w="100" w:type="dxa"/>
+              <w:start w:w="120" w:type="dxa"/>
+              <w:bottom w:w="100" w:type="dxa"/>
+              <w:end w:w="120" w:type="dxa"/>
+            </w:tcMar>
+            <w:vAlign w:val="center"/>
+          </w:tcPr>
+          <w:p>
+            <w:pPr>
+              <w:jc w:val="center"/>
+            </w:pPr>
+            <w:r>
+              <w:rPr>
+                <w:rFonts w:ascii="Arial" w:hAnsi="Arial"/>
+                <w:b/>
+                <w:i w:val="0"/>
+                <w:color w:val="FFFFFF"/>
+                <w:sz w:val="19"/>
+              </w:rPr>
+              <w:t>Team member</w:t>
+            </w:r>
+          </w:p>
+        </w:tc>
+        <w:tc>
+          <w:tcPr>
+            <w:tcW w:type="dxa" w:w="4824"/>
+            <w:shd w:fill="17324D"/>
+            <w:tcBorders>
+              <w:top w:val="single" w:sz="6" w:color="D9D9D9"/>
+              <w:left w:val="single" w:sz="6" w:color="D9D9D9"/>
+              <w:bottom w:val="single" w:sz="6" w:color="D9D9D9"/>
+              <w:right w:val="single" w:sz="6" w:color="D9D9D9"/>
+              <w:insideH w:val="single" w:sz="6" w:color="D9D9D9"/>
+              <w:insideV w:val="single" w:sz="6" w:color="D9D9D9"/>
+            </w:tcBorders>
+            <w:tcMar>
+              <w:top w:w="100" w:type="dxa"/>
+              <w:start w:w="120" w:type="dxa"/>
+              <w:bottom w:w="100" w:type="dxa"/>
+              <w:end w:w="120" w:type="dxa"/>
+            </w:tcMar>
+            <w:vAlign w:val="center"/>
+          </w:tcPr>
+          <w:p>
+            <w:pPr>
+              <w:jc w:val="center"/>
+            </w:pPr>
+            <w:r>
+              <w:rPr>
+                <w:rFonts w:ascii="Arial" w:hAnsi="Arial"/>
+                <w:b/>
+                <w:i w:val="0"/>
+                <w:color w:val="FFFFFF"/>
+                <w:sz w:val="19"/>
+              </w:rPr>
+              <w:t>Registration number</w:t>
+            </w:r>
+          </w:p>
+        </w:tc>
+      </w:tr>
+      <w:tr>
+        <w:trPr>
+          <w:cantSplit w:val="true"/>
+        </w:trPr>
+        <w:tc>
+          <w:tcPr>
+            <w:tcW w:type="dxa" w:w="4824"/>
+            <w:shd w:fill="FFFFFF"/>
+            <w:tcBorders>
+              <w:top w:val="single" w:sz="6" w:color="D9D9D9"/>
+              <w:left w:val="single" w:sz="6" w:color="D9D9D9"/>
+              <w:bottom w:val="single" w:sz="6" w:color="D9D9D9"/>
+              <w:right w:val="single" w:sz="6" w:color="D9D9D9"/>
+              <w:insideH w:val="single" w:sz="6" w:color="D9D9D9"/>
+              <w:insideV w:val="single" w:sz="6" w:color="D9D9D9"/>
+            </w:tcBorders>
+            <w:tcMar>
+              <w:top w:w="100" w:type="dxa"/>
+              <w:start w:w="120" w:type="dxa"/>
+              <w:bottom w:w="100" w:type="dxa"/>
+              <w:end w:w="120" w:type="dxa"/>
+            </w:tcMar>
+            <w:vAlign w:val="center"/>
+          </w:tcPr>
+          <w:p>
+            <w:pPr>
+              <w:jc w:val="left"/>
+            </w:pPr>
+            <w:r>
+              <w:rPr>
+                <w:rFonts w:ascii="Arial" w:hAnsi="Arial"/>
+                <w:b w:val="0"/>
+                <w:i w:val="0"/>
+                <w:color w:val="000000"/>
+                <w:sz w:val="18"/>
+              </w:rPr>
+              <w:t>Aprark</w:t>
+            </w:r>
+          </w:p>
+        </w:tc>
+        <w:tc>
+          <w:tcPr>
+            <w:tcW w:type="dxa" w:w="4824"/>
+            <w:shd w:fill="FFFFFF"/>
+            <w:tcBorders>
+              <w:top w:val="single" w:sz="6" w:color="D9D9D9"/>
+              <w:left w:val="single" w:sz="6" w:color="D9D9D9"/>
+              <w:bottom w:val="single" w:sz="6" w:color="D9D9D9"/>
+              <w:right w:val="single" w:sz="6" w:color="D9D9D9"/>
+              <w:insideH w:val="single" w:sz="6" w:color="D9D9D9"/>
+              <w:insideV w:val="single" w:sz="6" w:color="D9D9D9"/>
+            </w:tcBorders>
+            <w:tcMar>
+              <w:top w:w="100" w:type="dxa"/>
+              <w:start w:w="120" w:type="dxa"/>
+              <w:bottom w:w="100" w:type="dxa"/>
+              <w:end w:w="120" w:type="dxa"/>
+            </w:tcMar>
+            <w:vAlign w:val="center"/>
+          </w:tcPr>
+          <w:p>
+            <w:pPr>
+              <w:jc w:val="center"/>
+            </w:pPr>
+            <w:r>
+              <w:rPr>
+                <w:rFonts w:ascii="Arial" w:hAnsi="Arial"/>
+                <w:b w:val="0"/>
+                <w:i w:val="0"/>
+                <w:color w:val="000000"/>
+                <w:sz w:val="18"/>
+              </w:rPr>
+              <w:t>24BCI0052</w:t>
+            </w:r>
+          </w:p>
+        </w:tc>
+      </w:tr>
+      <w:tr>
+        <w:trPr>
+          <w:cantSplit w:val="true"/>
+        </w:trPr>
+        <w:tc>
+          <w:tcPr>
+            <w:tcW w:type="dxa" w:w="4824"/>
+            <w:shd w:fill="F4F8FB"/>
+            <w:tcBorders>
+              <w:top w:val="single" w:sz="6" w:color="D9D9D9"/>
+              <w:left w:val="single" w:sz="6" w:color="D9D9D9"/>
+              <w:bottom w:val="single" w:sz="6" w:color="D9D9D9"/>
+              <w:right w:val="single" w:sz="6" w:color="D9D9D9"/>
+              <w:insideH w:val="single" w:sz="6" w:color="D9D9D9"/>
+              <w:insideV w:val="single" w:sz="6" w:color="D9D9D9"/>
+            </w:tcBorders>
+            <w:tcMar>
+              <w:top w:w="100" w:type="dxa"/>
+              <w:start w:w="120" w:type="dxa"/>
+              <w:bottom w:w="100" w:type="dxa"/>
+              <w:end w:w="120" w:type="dxa"/>
+            </w:tcMar>
+            <w:vAlign w:val="center"/>
+          </w:tcPr>
+          <w:p>
+            <w:pPr>
+              <w:jc w:val="left"/>
+            </w:pPr>
+            <w:r>
+              <w:rPr>
+                <w:rFonts w:ascii="Arial" w:hAnsi="Arial"/>
+                <w:b w:val="0"/>
+                <w:i w:val="0"/>
+                <w:color w:val="000000"/>
+                <w:sz w:val="18"/>
+              </w:rPr>
+              <w:t>Aayushi</w:t>
+            </w:r>
+          </w:p>
+        </w:tc>
+        <w:tc>
+          <w:tcPr>
+            <w:tcW w:type="dxa" w:w="4824"/>
+            <w:shd w:fill="F4F8FB"/>
+            <w:tcBorders>
+              <w:top w:val="single" w:sz="6" w:color="D9D9D9"/>
+              <w:left w:val="single" w:sz="6" w:color="D9D9D9"/>
+              <w:bottom w:val="single" w:sz="6" w:color="D9D9D9"/>
+              <w:right w:val="single" w:sz="6" w:color="D9D9D9"/>
+              <w:insideH w:val="single" w:sz="6" w:color="D9D9D9"/>
+              <w:insideV w:val="single" w:sz="6" w:color="D9D9D9"/>
+            </w:tcBorders>
+            <w:tcMar>
+              <w:top w:w="100" w:type="dxa"/>
+              <w:start w:w="120" w:type="dxa"/>
+              <w:bottom w:w="100" w:type="dxa"/>
+              <w:end w:w="120" w:type="dxa"/>
+            </w:tcMar>
+            <w:vAlign w:val="center"/>
+          </w:tcPr>
+          <w:p>
+            <w:pPr>
+              <w:jc w:val="center"/>
+            </w:pPr>
+            <w:r>
+              <w:rPr>
+                <w:rFonts w:ascii="Arial" w:hAnsi="Arial"/>
+                <w:b w:val="0"/>
+                <w:i w:val="0"/>
+                <w:color w:val="000000"/>
+                <w:sz w:val="18"/>
+              </w:rPr>
+              <w:t>24BCE0481</w:t>
+            </w:r>
+          </w:p>
+        </w:tc>
+      </w:tr>
+      <w:tr>
+        <w:trPr>
+          <w:cantSplit w:val="true"/>
+        </w:trPr>
+        <w:tc>
+          <w:tcPr>
+            <w:tcW w:type="dxa" w:w="4824"/>
+            <w:shd w:fill="FFFFFF"/>
+            <w:tcBorders>
+              <w:top w:val="single" w:sz="6" w:color="D9D9D9"/>
+              <w:left w:val="single" w:sz="6" w:color="D9D9D9"/>
+              <w:bottom w:val="single" w:sz="6" w:color="D9D9D9"/>
+              <w:right w:val="single" w:sz="6" w:color="D9D9D9"/>
+              <w:insideH w:val="single" w:sz="6" w:color="D9D9D9"/>
+              <w:insideV w:val="single" w:sz="6" w:color="D9D9D9"/>
+            </w:tcBorders>
+            <w:tcMar>
+              <w:top w:w="100" w:type="dxa"/>
+              <w:start w:w="120" w:type="dxa"/>
+              <w:bottom w:w="100" w:type="dxa"/>
+              <w:end w:w="120" w:type="dxa"/>
+            </w:tcMar>
+            <w:vAlign w:val="center"/>
+          </w:tcPr>
+          <w:p>
+            <w:pPr>
+              <w:jc w:val="left"/>
+            </w:pPr>
+            <w:r>
+              <w:rPr>
+                <w:rFonts w:ascii="Arial" w:hAnsi="Arial"/>
+                <w:b w:val="0"/>
+                <w:i w:val="0"/>
+                <w:color w:val="000000"/>
+                <w:sz w:val="18"/>
+              </w:rPr>
+              <w:t>Shrey</w:t>
+            </w:r>
+          </w:p>
+        </w:tc>
+        <w:tc>
+          <w:tcPr>
+            <w:tcW w:type="dxa" w:w="4824"/>
+            <w:shd w:fill="FFFFFF"/>
+            <w:tcBorders>
+              <w:top w:val="single" w:sz="6" w:color="D9D9D9"/>
+              <w:left w:val="single" w:sz="6" w:color="D9D9D9"/>
+              <w:bottom w:val="single" w:sz="6" w:color="D9D9D9"/>
+              <w:right w:val="single" w:sz="6" w:color="D9D9D9"/>
+              <w:insideH w:val="single" w:sz="6" w:color="D9D9D9"/>
+              <w:insideV w:val="single" w:sz="6" w:color="D9D9D9"/>
+            </w:tcBorders>
+            <w:tcMar>
+              <w:top w:w="100" w:type="dxa"/>
+              <w:start w:w="120" w:type="dxa"/>
+              <w:bottom w:w="100" w:type="dxa"/>
+              <w:end w:w="120" w:type="dxa"/>
+            </w:tcMar>
+            <w:vAlign w:val="center"/>
+          </w:tcPr>
+          <w:p>
+            <w:pPr>
+              <w:jc w:val="center"/>
+            </w:pPr>
+            <w:r>
+              <w:rPr>
+                <w:rFonts w:ascii="Arial" w:hAnsi="Arial"/>
+                <w:b w:val="0"/>
+                <w:i w:val="0"/>
+                <w:color w:val="000000"/>
+                <w:sz w:val="18"/>
+              </w:rPr>
+              <w:t>24BCE2454</w:t>
+            </w:r>
+          </w:p>
+        </w:tc>
+      </w:tr>
+    </w:tbl>
     <w:p>
-      <w:r>
-        <w:rPr>
-          <w:rFonts w:ascii="Arial" w:hAnsi="Arial"/>
-          <w:b w:val="0"/>
-          <w:i w:val="0"/>
-          <w:color w:val="5B6573"/>
-          <w:sz w:val="22"/>
-        </w:rPr>
-        <w:t>Review package generated 28 October 2026</w:t>
-        <w:br/>
-      </w:r>
-      <w:r>
-        <w:rPr>
-          <w:rFonts w:ascii="Arial" w:hAnsi="Arial"/>
-          <w:b w:val="0"/>
-          <w:i w:val="0"/>
-          <w:color w:val="5B6573"/>
-          <w:sz w:val="22"/>
-        </w:rPr>
-        <w:t>Branch feature/v2-regex-engine</w:t>
-        <w:br/>
-      </w:r>
-      <w:r>
-        <w:rPr>
-          <w:rFonts w:ascii="Arial" w:hAnsi="Arial"/>
-          <w:b w:val="0"/>
-          <w:i w:val="0"/>
-          <w:color w:val="5B6573"/>
-          <w:sz w:val="22"/>
-        </w:rPr>
-        <w:t>Verified V2 commit d09673e</w:t>
-        <w:br/>
-      </w:r>
-      <w:r>
-        <w:rPr>
-          <w:rFonts w:ascii="Arial" w:hAnsi="Arial"/>
-          <w:b w:val="0"/>
-          <w:i w:val="0"/>
-          <w:color w:val="5B6573"/>
-          <w:sz w:val="22"/>
-        </w:rPr>
-        <w:t>Verified V1 checkpoint 09de2a6</w:t>
-        <w:br/>
-      </w:r>
+      <w:pPr>
+        <w:spacing w:after="40"/>
+      </w:pPr>
     </w:p>
     <w:p>
       <w:pPr>
@@ -9153,111 +9433,6 @@
         <w:br/>
       </w:r>
     </w:p>
-    <w:p>
-      <w:pPr>
-        <w:pStyle w:val="Heading1"/>
-        <w:keepNext/>
-      </w:pPr>
-      <w:r>
-        <w:t>9 References</w:t>
-      </w:r>
-    </w:p>
-    <w:p>
-      <w:pPr>
-        <w:spacing w:after="120"/>
-        <w:ind w:left="360" w:hanging="360"/>
-      </w:pPr>
-      <w:r>
-        <w:rPr>
-          <w:rFonts w:ascii="Arial" w:hAnsi="Arial"/>
-          <w:b w:val="0"/>
-          <w:i w:val="0"/>
-          <w:color w:val="000000"/>
-          <w:sz w:val="20"/>
-        </w:rPr>
-        <w:t>[1] A. V. Aho, M. S. Lam, R. Sethi, and J. D. Ullman, Compilers: Principles, Techniques, and Tools, 2nd ed., Pearson, 2006.</w:t>
-      </w:r>
-    </w:p>
-    <w:p>
-      <w:pPr>
-        <w:spacing w:after="120"/>
-        <w:ind w:left="360" w:hanging="360"/>
-      </w:pPr>
-      <w:r>
-        <w:rPr>
-          <w:rFonts w:ascii="Arial" w:hAnsi="Arial"/>
-          <w:b w:val="0"/>
-          <w:i w:val="0"/>
-          <w:color w:val="000000"/>
-          <w:sz w:val="20"/>
-        </w:rPr>
-        <w:t>[2] J. E. Hopcroft, R. Motwani, and J. D. Ullman, Introduction to Automata Theory, Languages, and Computation, 3rd ed., Pearson, 2006.</w:t>
-      </w:r>
-    </w:p>
-    <w:p>
-      <w:pPr>
-        <w:spacing w:after="120"/>
-        <w:ind w:left="360" w:hanging="360"/>
-      </w:pPr>
-      <w:r>
-        <w:rPr>
-          <w:rFonts w:ascii="Arial" w:hAnsi="Arial"/>
-          <w:b w:val="0"/>
-          <w:i w:val="0"/>
-          <w:color w:val="000000"/>
-          <w:sz w:val="20"/>
-        </w:rPr>
-        <w:t>[3] K. Thompson, Programming Techniques: Regular expression search algorithm, Communications of the ACM, vol. 11, no. 6, 1968.</w:t>
-      </w:r>
-    </w:p>
-    <w:p>
-      <w:pPr>
-        <w:spacing w:after="120"/>
-        <w:ind w:left="360" w:hanging="360"/>
-      </w:pPr>
-      <w:r>
-        <w:rPr>
-          <w:rFonts w:ascii="Arial" w:hAnsi="Arial"/>
-          <w:b w:val="0"/>
-          <w:i w:val="0"/>
-          <w:color w:val="000000"/>
-          <w:sz w:val="20"/>
-        </w:rPr>
-        <w:t>[4] Project source: regex_engine/parser.py, regex_engine/nfa.py, regex_engine/dfa.py, regex_engine/matcher.py, regex_engine/simulation.py, and regex_engine/analysis.py at commit d09673e.</w:t>
-      </w:r>
-    </w:p>
-    <w:p>
-      <w:pPr>
-        <w:spacing w:after="120"/>
-        <w:ind w:left="360" w:hanging="360"/>
-      </w:pPr>
-      <w:r>
-        <w:rPr>
-          <w:rFonts w:ascii="Arial" w:hAnsi="Arial"/>
-          <w:b w:val="0"/>
-          <w:i w:val="0"/>
-          <w:color w:val="000000"/>
-          <w:sz w:val="20"/>
-        </w:rPr>
-        <w:t>[5] Project semantics and limits: docs/V2_SEMANTICS.md at commit d09673e.</w:t>
-      </w:r>
-    </w:p>
-    <w:p>
-      <w:pPr>
-        <w:spacing w:after="120"/>
-        <w:ind w:left="360" w:hanging="360"/>
-      </w:pPr>
-      <w:r>
-        <w:rPr>
-          <w:rFonts w:ascii="Arial" w:hAnsi="Arial"/>
-          <w:b w:val="0"/>
-          <w:i w:val="0"/>
-          <w:color w:val="000000"/>
-          <w:sz w:val="20"/>
-        </w:rPr>
-        <w:t>[6] Measured evidence: benchmarks/review_2026_10_27/v1_v2_comparison.json and v2_feature_workloads.json.</w:t>
-      </w:r>
-    </w:p>
     <w:sectPr>
       <w:footerReference w:type="default" r:id="rId9"/>
       <w:pgSz w:w="12240" w:h="15840"/>

</xml_diff>

<commit_message>
docs: finalize report limitations section
</commit_message>
<xml_diff>
--- a/review/Compiler_Design_Project_Review_Report.docx
+++ b/review/Compiler_Design_Project_Review_Report.docx
@@ -399,7 +399,7 @@
           <w:color w:val="000000"/>
           <w:sz w:val="22"/>
         </w:rPr>
-        <w:t>The fair shared-syntax comparison found unchanged NFA and lazy-DFA state counts and effectively flat process memory. Core matching was slower in V2 by 3.45 to 4.55 times on the three measured workloads because each input character now uses generalized symbolic-class signature checks. The report treats this as a measured optimization opportunity, not as a regression hidden by feature-only benchmarks.</w:t>
+        <w:t>The fair shared-syntax comparison found unchanged NFA and lazy-DFA state counts and effectively flat process memory. Core matching was slower in V2 by 3.45 to 4.55 times on the three measured workloads because each input character now uses generalized symbolic-class signature checks. The report records this result as a measured limitation.</w:t>
       </w:r>
     </w:p>
     <w:p>
@@ -9256,7 +9256,7 @@
         <w:keepNext/>
       </w:pPr>
       <w:r>
-        <w:t>8 Limitations and next work</w:t>
+        <w:t>8 Limitations</w:t>
       </w:r>
     </w:p>
     <w:p>
@@ -9282,7 +9282,7 @@
           <w:color w:val="000000"/>
           <w:sz w:val="22"/>
         </w:rPr>
-        <w:t>V2 core matching is measurably slower on the shared workloads. Cache character signatures per input class or add a literal fast path, then rerun the same protocol.</w:t>
+        <w:t>V2 core matching is measurably slower on the shared workloads.</w:t>
       </w:r>
       <w:r>
         <w:br/>

</xml_diff>

<commit_message>
docs: finalize project review report
</commit_message>
<xml_diff>
--- a/review/Compiler_Design_Project_Review_Report.docx
+++ b/review/Compiler_Design_Project_Review_Report.docx
@@ -29,7 +29,7 @@
           <w:color w:val="17324D"/>
           <w:sz w:val="40"/>
         </w:rPr>
-        <w:t>Compiler Design Project Review Report</w:t>
+        <w:t>BCSE307P Compiler Design Project Review Report</w:t>
       </w:r>
     </w:p>
     <w:tbl>
@@ -430,6 +430,32 @@
         </w:rPr>
         <w:t>This project implements a full-string regular-expression matcher for a Compiler Design review. The implementation parses a pattern into an abstract syntax tree, applies Thompson construction to build an NFA, converts NFA subsets into DFA states on demand, and returns MATCH or NO MATCH. The local FastAPI dashboard exposes matching, simulation, automaton views, performance analysis, and a predefined test suite.</w:t>
       </w:r>
+    </w:p>
+    <w:p>
+      <w:pPr>
+        <w:spacing w:after="160"/>
+      </w:pPr>
+      <w:r>
+        <w:rPr>
+          <w:rFonts w:ascii="Arial" w:hAnsi="Arial"/>
+          <w:b/>
+          <w:i w:val="0"/>
+          <w:color w:val="000000"/>
+          <w:sz w:val="22"/>
+        </w:rPr>
+        <w:t xml:space="preserve">Project repository: </w:t>
+      </w:r>
+      <w:hyperlink r:id="rId10">
+        <w:r>
+          <w:rPr>
+            <w:rFonts w:ascii="Arial" w:hAnsi="Arial"/>
+            <w:color w:val="2E6F9E"/>
+            <w:u w:val="single"/>
+            <w:sz w:val="22"/>
+          </w:rPr>
+          <w:t>https://github.com/shreyyyyy777/compiler_project/tree/feature/v2-regex-engine</w:t>
+        </w:r>
+      </w:hyperlink>
     </w:p>
     <w:tbl>
       <w:tblPr>
@@ -4967,7 +4993,7 @@
                     <pic:cNvPicPr/>
                   </pic:nvPicPr>
                   <pic:blipFill>
-                    <a:blip r:embed="rId10"/>
+                    <a:blip r:embed="rId11"/>
                     <a:stretch>
                       <a:fillRect/>
                     </a:stretch>
@@ -5047,7 +5073,7 @@
                     <pic:cNvPicPr/>
                   </pic:nvPicPr>
                   <pic:blipFill>
-                    <a:blip r:embed="rId11"/>
+                    <a:blip r:embed="rId12"/>
                     <a:stretch>
                       <a:fillRect/>
                     </a:stretch>
@@ -5103,7 +5129,7 @@
                     <pic:cNvPicPr/>
                   </pic:nvPicPr>
                   <pic:blipFill>
-                    <a:blip r:embed="rId12"/>
+                    <a:blip r:embed="rId13"/>
                     <a:stretch>
                       <a:fillRect/>
                     </a:stretch>
@@ -6341,7 +6367,7 @@
                 <w:color w:val="000000"/>
                 <w:sz w:val="17"/>
               </w:rPr>
-              <w:t>0.0083</w:t>
+              <w:t>0.0085</w:t>
             </w:r>
           </w:p>
         </w:tc>
@@ -6598,7 +6624,7 @@
                 <w:color w:val="000000"/>
                 <w:sz w:val="17"/>
               </w:rPr>
-              <w:t>0.5136</w:t>
+              <w:t>0.5201</w:t>
             </w:r>
           </w:p>
         </w:tc>
@@ -7503,7 +7529,7 @@
                     <pic:cNvPicPr/>
                   </pic:nvPicPr>
                   <pic:blipFill>
-                    <a:blip r:embed="rId13"/>
+                    <a:blip r:embed="rId14"/>
                     <a:stretch>
                       <a:fillRect/>
                     </a:stretch>
@@ -7559,7 +7585,7 @@
                     <pic:cNvPicPr/>
                   </pic:nvPicPr>
                   <pic:blipFill>
-                    <a:blip r:embed="rId14"/>
+                    <a:blip r:embed="rId15"/>
                     <a:stretch>
                       <a:fillRect/>
                     </a:stretch>
@@ -9433,6 +9459,807 @@
         <w:br/>
       </w:r>
     </w:p>
+    <w:p>
+      <w:pPr>
+        <w:pStyle w:val="Heading1"/>
+        <w:keepNext/>
+      </w:pPr>
+      <w:r>
+        <w:t>9 Future work</w:t>
+      </w:r>
+    </w:p>
+    <w:p>
+      <w:pPr>
+        <w:spacing w:after="140" w:line="259" w:lineRule="auto"/>
+      </w:pPr>
+      <w:r>
+        <w:rPr>
+          <w:rFonts w:ascii="Arial" w:hAnsi="Arial"/>
+          <w:b w:val="0"/>
+          <w:i w:val="0"/>
+          <w:color w:val="000000"/>
+          <w:sz w:val="22"/>
+        </w:rPr>
+        <w:t>The following extensions are deliberately framed as future work rather than completed features. Each item includes a concrete acceptance condition so that later improvements can be evaluated with evidence instead of expectation.</w:t>
+      </w:r>
+    </w:p>
+    <w:tbl>
+      <w:tblPr>
+        <w:tblW w:type="auto" w:w="0"/>
+        <w:jc w:val="center"/>
+        <w:tblLayout w:type="fixed"/>
+        <w:tblLook w:firstColumn="1" w:firstRow="1" w:lastColumn="0" w:lastRow="0" w:noHBand="0" w:noVBand="1" w:val="04A0"/>
+      </w:tblPr>
+      <w:tblGrid>
+        <w:gridCol w:w="3312"/>
+        <w:gridCol w:w="3312"/>
+        <w:gridCol w:w="3312"/>
+      </w:tblGrid>
+      <w:tr>
+        <w:trPr>
+          <w:tblHeader w:val="true"/>
+          <w:cantSplit w:val="true"/>
+        </w:trPr>
+        <w:tc>
+          <w:tcPr>
+            <w:tcW w:type="dxa" w:w="1512"/>
+            <w:shd w:fill="17324D"/>
+            <w:tcBorders>
+              <w:top w:val="single" w:sz="6" w:color="D9D9D9"/>
+              <w:left w:val="single" w:sz="6" w:color="D9D9D9"/>
+              <w:bottom w:val="single" w:sz="6" w:color="D9D9D9"/>
+              <w:right w:val="single" w:sz="6" w:color="D9D9D9"/>
+              <w:insideH w:val="single" w:sz="6" w:color="D9D9D9"/>
+              <w:insideV w:val="single" w:sz="6" w:color="D9D9D9"/>
+            </w:tcBorders>
+            <w:tcMar>
+              <w:top w:w="100" w:type="dxa"/>
+              <w:start w:w="120" w:type="dxa"/>
+              <w:bottom w:w="100" w:type="dxa"/>
+              <w:end w:w="120" w:type="dxa"/>
+            </w:tcMar>
+            <w:vAlign w:val="center"/>
+          </w:tcPr>
+          <w:p>
+            <w:pPr>
+              <w:jc w:val="center"/>
+            </w:pPr>
+            <w:r>
+              <w:rPr>
+                <w:rFonts w:ascii="Arial" w:hAnsi="Arial"/>
+                <w:b/>
+                <w:i w:val="0"/>
+                <w:color w:val="FFFFFF"/>
+                <w:sz w:val="18"/>
+              </w:rPr>
+              <w:t>Area</w:t>
+            </w:r>
+          </w:p>
+        </w:tc>
+        <w:tc>
+          <w:tcPr>
+            <w:tcW w:type="dxa" w:w="4032"/>
+            <w:shd w:fill="17324D"/>
+            <w:tcBorders>
+              <w:top w:val="single" w:sz="6" w:color="D9D9D9"/>
+              <w:left w:val="single" w:sz="6" w:color="D9D9D9"/>
+              <w:bottom w:val="single" w:sz="6" w:color="D9D9D9"/>
+              <w:right w:val="single" w:sz="6" w:color="D9D9D9"/>
+              <w:insideH w:val="single" w:sz="6" w:color="D9D9D9"/>
+              <w:insideV w:val="single" w:sz="6" w:color="D9D9D9"/>
+            </w:tcBorders>
+            <w:tcMar>
+              <w:top w:w="100" w:type="dxa"/>
+              <w:start w:w="120" w:type="dxa"/>
+              <w:bottom w:w="100" w:type="dxa"/>
+              <w:end w:w="120" w:type="dxa"/>
+            </w:tcMar>
+            <w:vAlign w:val="center"/>
+          </w:tcPr>
+          <w:p>
+            <w:pPr>
+              <w:jc w:val="center"/>
+            </w:pPr>
+            <w:r>
+              <w:rPr>
+                <w:rFonts w:ascii="Arial" w:hAnsi="Arial"/>
+                <w:b/>
+                <w:i w:val="0"/>
+                <w:color w:val="FFFFFF"/>
+                <w:sz w:val="18"/>
+              </w:rPr>
+              <w:t>Proposed extension</w:t>
+            </w:r>
+          </w:p>
+        </w:tc>
+        <w:tc>
+          <w:tcPr>
+            <w:tcW w:type="dxa" w:w="4392"/>
+            <w:shd w:fill="17324D"/>
+            <w:tcBorders>
+              <w:top w:val="single" w:sz="6" w:color="D9D9D9"/>
+              <w:left w:val="single" w:sz="6" w:color="D9D9D9"/>
+              <w:bottom w:val="single" w:sz="6" w:color="D9D9D9"/>
+              <w:right w:val="single" w:sz="6" w:color="D9D9D9"/>
+              <w:insideH w:val="single" w:sz="6" w:color="D9D9D9"/>
+              <w:insideV w:val="single" w:sz="6" w:color="D9D9D9"/>
+            </w:tcBorders>
+            <w:tcMar>
+              <w:top w:w="100" w:type="dxa"/>
+              <w:start w:w="120" w:type="dxa"/>
+              <w:bottom w:w="100" w:type="dxa"/>
+              <w:end w:w="120" w:type="dxa"/>
+            </w:tcMar>
+            <w:vAlign w:val="center"/>
+          </w:tcPr>
+          <w:p>
+            <w:pPr>
+              <w:jc w:val="center"/>
+            </w:pPr>
+            <w:r>
+              <w:rPr>
+                <w:rFonts w:ascii="Arial" w:hAnsi="Arial"/>
+                <w:b/>
+                <w:i w:val="0"/>
+                <w:color w:val="FFFFFF"/>
+                <w:sz w:val="18"/>
+              </w:rPr>
+              <w:t>Acceptance evidence</w:t>
+            </w:r>
+          </w:p>
+        </w:tc>
+      </w:tr>
+      <w:tr>
+        <w:trPr>
+          <w:cantSplit w:val="true"/>
+        </w:trPr>
+        <w:tc>
+          <w:tcPr>
+            <w:tcW w:type="dxa" w:w="1512"/>
+            <w:shd w:fill="FFFFFF"/>
+            <w:tcBorders>
+              <w:top w:val="single" w:sz="6" w:color="D9D9D9"/>
+              <w:left w:val="single" w:sz="6" w:color="D9D9D9"/>
+              <w:bottom w:val="single" w:sz="6" w:color="D9D9D9"/>
+              <w:right w:val="single" w:sz="6" w:color="D9D9D9"/>
+              <w:insideH w:val="single" w:sz="6" w:color="D9D9D9"/>
+              <w:insideV w:val="single" w:sz="6" w:color="D9D9D9"/>
+            </w:tcBorders>
+            <w:tcMar>
+              <w:top w:w="100" w:type="dxa"/>
+              <w:start w:w="120" w:type="dxa"/>
+              <w:bottom w:w="100" w:type="dxa"/>
+              <w:end w:w="120" w:type="dxa"/>
+            </w:tcMar>
+            <w:vAlign w:val="center"/>
+          </w:tcPr>
+          <w:p>
+            <w:pPr>
+              <w:jc w:val="left"/>
+            </w:pPr>
+            <w:r>
+              <w:rPr>
+                <w:rFonts w:ascii="Arial" w:hAnsi="Arial"/>
+                <w:b w:val="0"/>
+                <w:i w:val="0"/>
+                <w:color w:val="000000"/>
+                <w:sz w:val="17"/>
+              </w:rPr>
+              <w:t>Runtime</w:t>
+            </w:r>
+          </w:p>
+        </w:tc>
+        <w:tc>
+          <w:tcPr>
+            <w:tcW w:type="dxa" w:w="4032"/>
+            <w:shd w:fill="FFFFFF"/>
+            <w:tcBorders>
+              <w:top w:val="single" w:sz="6" w:color="D9D9D9"/>
+              <w:left w:val="single" w:sz="6" w:color="D9D9D9"/>
+              <w:bottom w:val="single" w:sz="6" w:color="D9D9D9"/>
+              <w:right w:val="single" w:sz="6" w:color="D9D9D9"/>
+              <w:insideH w:val="single" w:sz="6" w:color="D9D9D9"/>
+              <w:insideV w:val="single" w:sz="6" w:color="D9D9D9"/>
+            </w:tcBorders>
+            <w:tcMar>
+              <w:top w:w="100" w:type="dxa"/>
+              <w:start w:w="120" w:type="dxa"/>
+              <w:bottom w:w="100" w:type="dxa"/>
+              <w:end w:w="120" w:type="dxa"/>
+            </w:tcMar>
+            <w:vAlign w:val="center"/>
+          </w:tcPr>
+          <w:p>
+            <w:pPr>
+              <w:jc w:val="left"/>
+            </w:pPr>
+            <w:r>
+              <w:rPr>
+                <w:rFonts w:ascii="Arial" w:hAnsi="Arial"/>
+                <w:b w:val="0"/>
+                <w:i w:val="0"/>
+                <w:color w:val="000000"/>
+                <w:sz w:val="17"/>
+              </w:rPr>
+              <w:t>Cache or precompute symbolic transition signatures to reduce V2 per-character overhead.</w:t>
+            </w:r>
+          </w:p>
+        </w:tc>
+        <w:tc>
+          <w:tcPr>
+            <w:tcW w:type="dxa" w:w="4392"/>
+            <w:shd w:fill="FFFFFF"/>
+            <w:tcBorders>
+              <w:top w:val="single" w:sz="6" w:color="D9D9D9"/>
+              <w:left w:val="single" w:sz="6" w:color="D9D9D9"/>
+              <w:bottom w:val="single" w:sz="6" w:color="D9D9D9"/>
+              <w:right w:val="single" w:sz="6" w:color="D9D9D9"/>
+              <w:insideH w:val="single" w:sz="6" w:color="D9D9D9"/>
+              <w:insideV w:val="single" w:sz="6" w:color="D9D9D9"/>
+            </w:tcBorders>
+            <w:tcMar>
+              <w:top w:w="100" w:type="dxa"/>
+              <w:start w:w="120" w:type="dxa"/>
+              <w:bottom w:w="100" w:type="dxa"/>
+              <w:end w:w="120" w:type="dxa"/>
+            </w:tcMar>
+            <w:vAlign w:val="center"/>
+          </w:tcPr>
+          <w:p>
+            <w:pPr>
+              <w:jc w:val="left"/>
+            </w:pPr>
+            <w:r>
+              <w:rPr>
+                <w:rFonts w:ascii="Arial" w:hAnsi="Arial"/>
+                <w:b w:val="0"/>
+                <w:i w:val="0"/>
+                <w:color w:val="000000"/>
+                <w:sz w:val="17"/>
+              </w:rPr>
+              <w:t>Repeat the same alternating-process benchmark and show lower medians without changed match results.</w:t>
+            </w:r>
+          </w:p>
+        </w:tc>
+      </w:tr>
+      <w:tr>
+        <w:trPr>
+          <w:cantSplit w:val="true"/>
+        </w:trPr>
+        <w:tc>
+          <w:tcPr>
+            <w:tcW w:type="dxa" w:w="1512"/>
+            <w:shd w:fill="F4F8FB"/>
+            <w:tcBorders>
+              <w:top w:val="single" w:sz="6" w:color="D9D9D9"/>
+              <w:left w:val="single" w:sz="6" w:color="D9D9D9"/>
+              <w:bottom w:val="single" w:sz="6" w:color="D9D9D9"/>
+              <w:right w:val="single" w:sz="6" w:color="D9D9D9"/>
+              <w:insideH w:val="single" w:sz="6" w:color="D9D9D9"/>
+              <w:insideV w:val="single" w:sz="6" w:color="D9D9D9"/>
+            </w:tcBorders>
+            <w:tcMar>
+              <w:top w:w="100" w:type="dxa"/>
+              <w:start w:w="120" w:type="dxa"/>
+              <w:bottom w:w="100" w:type="dxa"/>
+              <w:end w:w="120" w:type="dxa"/>
+            </w:tcMar>
+            <w:vAlign w:val="center"/>
+          </w:tcPr>
+          <w:p>
+            <w:pPr>
+              <w:jc w:val="left"/>
+            </w:pPr>
+            <w:r>
+              <w:rPr>
+                <w:rFonts w:ascii="Arial" w:hAnsi="Arial"/>
+                <w:b w:val="0"/>
+                <w:i w:val="0"/>
+                <w:color w:val="000000"/>
+                <w:sz w:val="17"/>
+              </w:rPr>
+              <w:t>Automation</w:t>
+            </w:r>
+          </w:p>
+        </w:tc>
+        <w:tc>
+          <w:tcPr>
+            <w:tcW w:type="dxa" w:w="4032"/>
+            <w:shd w:fill="F4F8FB"/>
+            <w:tcBorders>
+              <w:top w:val="single" w:sz="6" w:color="D9D9D9"/>
+              <w:left w:val="single" w:sz="6" w:color="D9D9D9"/>
+              <w:bottom w:val="single" w:sz="6" w:color="D9D9D9"/>
+              <w:right w:val="single" w:sz="6" w:color="D9D9D9"/>
+              <w:insideH w:val="single" w:sz="6" w:color="D9D9D9"/>
+              <w:insideV w:val="single" w:sz="6" w:color="D9D9D9"/>
+            </w:tcBorders>
+            <w:tcMar>
+              <w:top w:w="100" w:type="dxa"/>
+              <w:start w:w="120" w:type="dxa"/>
+              <w:bottom w:w="100" w:type="dxa"/>
+              <w:end w:w="120" w:type="dxa"/>
+            </w:tcMar>
+            <w:vAlign w:val="center"/>
+          </w:tcPr>
+          <w:p>
+            <w:pPr>
+              <w:jc w:val="left"/>
+            </w:pPr>
+            <w:r>
+              <w:rPr>
+                <w:rFonts w:ascii="Arial" w:hAnsi="Arial"/>
+                <w:b w:val="0"/>
+                <w:i w:val="0"/>
+                <w:color w:val="000000"/>
+                <w:sz w:val="17"/>
+              </w:rPr>
+              <w:t>Add continuous integration for the Python tests and source syntax checks.</w:t>
+            </w:r>
+          </w:p>
+        </w:tc>
+        <w:tc>
+          <w:tcPr>
+            <w:tcW w:type="dxa" w:w="4392"/>
+            <w:shd w:fill="F4F8FB"/>
+            <w:tcBorders>
+              <w:top w:val="single" w:sz="6" w:color="D9D9D9"/>
+              <w:left w:val="single" w:sz="6" w:color="D9D9D9"/>
+              <w:bottom w:val="single" w:sz="6" w:color="D9D9D9"/>
+              <w:right w:val="single" w:sz="6" w:color="D9D9D9"/>
+              <w:insideH w:val="single" w:sz="6" w:color="D9D9D9"/>
+              <w:insideV w:val="single" w:sz="6" w:color="D9D9D9"/>
+            </w:tcBorders>
+            <w:tcMar>
+              <w:top w:w="100" w:type="dxa"/>
+              <w:start w:w="120" w:type="dxa"/>
+              <w:bottom w:w="100" w:type="dxa"/>
+              <w:end w:w="120" w:type="dxa"/>
+            </w:tcMar>
+            <w:vAlign w:val="center"/>
+          </w:tcPr>
+          <w:p>
+            <w:pPr>
+              <w:jc w:val="left"/>
+            </w:pPr>
+            <w:r>
+              <w:rPr>
+                <w:rFonts w:ascii="Arial" w:hAnsi="Arial"/>
+                <w:b w:val="0"/>
+                <w:i w:val="0"/>
+                <w:color w:val="000000"/>
+                <w:sz w:val="17"/>
+              </w:rPr>
+              <w:t>A clean checkout passes automatically on every pushed change and pull request.</w:t>
+            </w:r>
+          </w:p>
+        </w:tc>
+      </w:tr>
+      <w:tr>
+        <w:trPr>
+          <w:cantSplit w:val="true"/>
+        </w:trPr>
+        <w:tc>
+          <w:tcPr>
+            <w:tcW w:type="dxa" w:w="1512"/>
+            <w:shd w:fill="FFFFFF"/>
+            <w:tcBorders>
+              <w:top w:val="single" w:sz="6" w:color="D9D9D9"/>
+              <w:left w:val="single" w:sz="6" w:color="D9D9D9"/>
+              <w:bottom w:val="single" w:sz="6" w:color="D9D9D9"/>
+              <w:right w:val="single" w:sz="6" w:color="D9D9D9"/>
+              <w:insideH w:val="single" w:sz="6" w:color="D9D9D9"/>
+              <w:insideV w:val="single" w:sz="6" w:color="D9D9D9"/>
+            </w:tcBorders>
+            <w:tcMar>
+              <w:top w:w="100" w:type="dxa"/>
+              <w:start w:w="120" w:type="dxa"/>
+              <w:bottom w:w="100" w:type="dxa"/>
+              <w:end w:w="120" w:type="dxa"/>
+            </w:tcMar>
+            <w:vAlign w:val="center"/>
+          </w:tcPr>
+          <w:p>
+            <w:pPr>
+              <w:jc w:val="left"/>
+            </w:pPr>
+            <w:r>
+              <w:rPr>
+                <w:rFonts w:ascii="Arial" w:hAnsi="Arial"/>
+                <w:b w:val="0"/>
+                <w:i w:val="0"/>
+                <w:color w:val="000000"/>
+                <w:sz w:val="17"/>
+              </w:rPr>
+              <w:t>Memory</w:t>
+            </w:r>
+          </w:p>
+        </w:tc>
+        <w:tc>
+          <w:tcPr>
+            <w:tcW w:type="dxa" w:w="4032"/>
+            <w:shd w:fill="FFFFFF"/>
+            <w:tcBorders>
+              <w:top w:val="single" w:sz="6" w:color="D9D9D9"/>
+              <w:left w:val="single" w:sz="6" w:color="D9D9D9"/>
+              <w:bottom w:val="single" w:sz="6" w:color="D9D9D9"/>
+              <w:right w:val="single" w:sz="6" w:color="D9D9D9"/>
+              <w:insideH w:val="single" w:sz="6" w:color="D9D9D9"/>
+              <w:insideV w:val="single" w:sz="6" w:color="D9D9D9"/>
+            </w:tcBorders>
+            <w:tcMar>
+              <w:top w:w="100" w:type="dxa"/>
+              <w:start w:w="120" w:type="dxa"/>
+              <w:bottom w:w="100" w:type="dxa"/>
+              <w:end w:w="120" w:type="dxa"/>
+            </w:tcMar>
+            <w:vAlign w:val="center"/>
+          </w:tcPr>
+          <w:p>
+            <w:pPr>
+              <w:jc w:val="left"/>
+            </w:pPr>
+            <w:r>
+              <w:rPr>
+                <w:rFonts w:ascii="Arial" w:hAnsi="Arial"/>
+                <w:b w:val="0"/>
+                <w:i w:val="0"/>
+                <w:color w:val="000000"/>
+                <w:sz w:val="17"/>
+              </w:rPr>
+              <w:t>Profile allocations during longer repeated workloads instead of relying mainly on process peak RSS.</w:t>
+            </w:r>
+          </w:p>
+        </w:tc>
+        <w:tc>
+          <w:tcPr>
+            <w:tcW w:type="dxa" w:w="4392"/>
+            <w:shd w:fill="FFFFFF"/>
+            <w:tcBorders>
+              <w:top w:val="single" w:sz="6" w:color="D9D9D9"/>
+              <w:left w:val="single" w:sz="6" w:color="D9D9D9"/>
+              <w:bottom w:val="single" w:sz="6" w:color="D9D9D9"/>
+              <w:right w:val="single" w:sz="6" w:color="D9D9D9"/>
+              <w:insideH w:val="single" w:sz="6" w:color="D9D9D9"/>
+              <w:insideV w:val="single" w:sz="6" w:color="D9D9D9"/>
+            </w:tcBorders>
+            <w:tcMar>
+              <w:top w:w="100" w:type="dxa"/>
+              <w:start w:w="120" w:type="dxa"/>
+              <w:bottom w:w="100" w:type="dxa"/>
+              <w:end w:w="120" w:type="dxa"/>
+            </w:tcMar>
+            <w:vAlign w:val="center"/>
+          </w:tcPr>
+          <w:p>
+            <w:pPr>
+              <w:jc w:val="left"/>
+            </w:pPr>
+            <w:r>
+              <w:rPr>
+                <w:rFonts w:ascii="Arial" w:hAnsi="Arial"/>
+                <w:b w:val="0"/>
+                <w:i w:val="0"/>
+                <w:color w:val="000000"/>
+                <w:sz w:val="17"/>
+              </w:rPr>
+              <w:t>Publish reproducible traces that identify retained objects and allocation hot spots.</w:t>
+            </w:r>
+          </w:p>
+        </w:tc>
+      </w:tr>
+      <w:tr>
+        <w:trPr>
+          <w:cantSplit w:val="true"/>
+        </w:trPr>
+        <w:tc>
+          <w:tcPr>
+            <w:tcW w:type="dxa" w:w="1512"/>
+            <w:shd w:fill="F4F8FB"/>
+            <w:tcBorders>
+              <w:top w:val="single" w:sz="6" w:color="D9D9D9"/>
+              <w:left w:val="single" w:sz="6" w:color="D9D9D9"/>
+              <w:bottom w:val="single" w:sz="6" w:color="D9D9D9"/>
+              <w:right w:val="single" w:sz="6" w:color="D9D9D9"/>
+              <w:insideH w:val="single" w:sz="6" w:color="D9D9D9"/>
+              <w:insideV w:val="single" w:sz="6" w:color="D9D9D9"/>
+            </w:tcBorders>
+            <w:tcMar>
+              <w:top w:w="100" w:type="dxa"/>
+              <w:start w:w="120" w:type="dxa"/>
+              <w:bottom w:w="100" w:type="dxa"/>
+              <w:end w:w="120" w:type="dxa"/>
+            </w:tcMar>
+            <w:vAlign w:val="center"/>
+          </w:tcPr>
+          <w:p>
+            <w:pPr>
+              <w:jc w:val="left"/>
+            </w:pPr>
+            <w:r>
+              <w:rPr>
+                <w:rFonts w:ascii="Arial" w:hAnsi="Arial"/>
+                <w:b w:val="0"/>
+                <w:i w:val="0"/>
+                <w:color w:val="000000"/>
+                <w:sz w:val="17"/>
+              </w:rPr>
+              <w:t>Language support</w:t>
+            </w:r>
+          </w:p>
+        </w:tc>
+        <w:tc>
+          <w:tcPr>
+            <w:tcW w:type="dxa" w:w="4032"/>
+            <w:shd w:fill="F4F8FB"/>
+            <w:tcBorders>
+              <w:top w:val="single" w:sz="6" w:color="D9D9D9"/>
+              <w:left w:val="single" w:sz="6" w:color="D9D9D9"/>
+              <w:bottom w:val="single" w:sz="6" w:color="D9D9D9"/>
+              <w:right w:val="single" w:sz="6" w:color="D9D9D9"/>
+              <w:insideH w:val="single" w:sz="6" w:color="D9D9D9"/>
+              <w:insideV w:val="single" w:sz="6" w:color="D9D9D9"/>
+            </w:tcBorders>
+            <w:tcMar>
+              <w:top w:w="100" w:type="dxa"/>
+              <w:start w:w="120" w:type="dxa"/>
+              <w:bottom w:w="100" w:type="dxa"/>
+              <w:end w:w="120" w:type="dxa"/>
+            </w:tcMar>
+            <w:vAlign w:val="center"/>
+          </w:tcPr>
+          <w:p>
+            <w:pPr>
+              <w:jc w:val="left"/>
+            </w:pPr>
+            <w:r>
+              <w:rPr>
+                <w:rFonts w:ascii="Arial" w:hAnsi="Arial"/>
+                <w:b w:val="0"/>
+                <w:i w:val="0"/>
+                <w:color w:val="000000"/>
+                <w:sz w:val="17"/>
+              </w:rPr>
+              <w:t>Evaluate substring search, shorthand classes, flags, and capture metadata in small, independently tested increments.</w:t>
+            </w:r>
+          </w:p>
+        </w:tc>
+        <w:tc>
+          <w:tcPr>
+            <w:tcW w:type="dxa" w:w="4392"/>
+            <w:shd w:fill="F4F8FB"/>
+            <w:tcBorders>
+              <w:top w:val="single" w:sz="6" w:color="D9D9D9"/>
+              <w:left w:val="single" w:sz="6" w:color="D9D9D9"/>
+              <w:bottom w:val="single" w:sz="6" w:color="D9D9D9"/>
+              <w:right w:val="single" w:sz="6" w:color="D9D9D9"/>
+              <w:insideH w:val="single" w:sz="6" w:color="D9D9D9"/>
+              <w:insideV w:val="single" w:sz="6" w:color="D9D9D9"/>
+            </w:tcBorders>
+            <w:tcMar>
+              <w:top w:w="100" w:type="dxa"/>
+              <w:start w:w="120" w:type="dxa"/>
+              <w:bottom w:w="100" w:type="dxa"/>
+              <w:end w:w="120" w:type="dxa"/>
+            </w:tcMar>
+            <w:vAlign w:val="center"/>
+          </w:tcPr>
+          <w:p>
+            <w:pPr>
+              <w:jc w:val="left"/>
+            </w:pPr>
+            <w:r>
+              <w:rPr>
+                <w:rFonts w:ascii="Arial" w:hAnsi="Arial"/>
+                <w:b w:val="0"/>
+                <w:i w:val="0"/>
+                <w:color w:val="000000"/>
+                <w:sz w:val="17"/>
+              </w:rPr>
+              <w:t>Document exact semantics, enforce safety budgets, and add positive, negative, and limit tests for each feature.</w:t>
+            </w:r>
+          </w:p>
+        </w:tc>
+      </w:tr>
+      <w:tr>
+        <w:trPr>
+          <w:cantSplit w:val="true"/>
+        </w:trPr>
+        <w:tc>
+          <w:tcPr>
+            <w:tcW w:type="dxa" w:w="1512"/>
+            <w:shd w:fill="FFFFFF"/>
+            <w:tcBorders>
+              <w:top w:val="single" w:sz="6" w:color="D9D9D9"/>
+              <w:left w:val="single" w:sz="6" w:color="D9D9D9"/>
+              <w:bottom w:val="single" w:sz="6" w:color="D9D9D9"/>
+              <w:right w:val="single" w:sz="6" w:color="D9D9D9"/>
+              <w:insideH w:val="single" w:sz="6" w:color="D9D9D9"/>
+              <w:insideV w:val="single" w:sz="6" w:color="D9D9D9"/>
+            </w:tcBorders>
+            <w:tcMar>
+              <w:top w:w="100" w:type="dxa"/>
+              <w:start w:w="120" w:type="dxa"/>
+              <w:bottom w:w="100" w:type="dxa"/>
+              <w:end w:w="120" w:type="dxa"/>
+            </w:tcMar>
+            <w:vAlign w:val="center"/>
+          </w:tcPr>
+          <w:p>
+            <w:pPr>
+              <w:jc w:val="left"/>
+            </w:pPr>
+            <w:r>
+              <w:rPr>
+                <w:rFonts w:ascii="Arial" w:hAnsi="Arial"/>
+                <w:b w:val="0"/>
+                <w:i w:val="0"/>
+                <w:color w:val="000000"/>
+                <w:sz w:val="17"/>
+              </w:rPr>
+              <w:t>Visualization</w:t>
+            </w:r>
+          </w:p>
+        </w:tc>
+        <w:tc>
+          <w:tcPr>
+            <w:tcW w:type="dxa" w:w="4032"/>
+            <w:shd w:fill="FFFFFF"/>
+            <w:tcBorders>
+              <w:top w:val="single" w:sz="6" w:color="D9D9D9"/>
+              <w:left w:val="single" w:sz="6" w:color="D9D9D9"/>
+              <w:bottom w:val="single" w:sz="6" w:color="D9D9D9"/>
+              <w:right w:val="single" w:sz="6" w:color="D9D9D9"/>
+              <w:insideH w:val="single" w:sz="6" w:color="D9D9D9"/>
+              <w:insideV w:val="single" w:sz="6" w:color="D9D9D9"/>
+            </w:tcBorders>
+            <w:tcMar>
+              <w:top w:w="100" w:type="dxa"/>
+              <w:start w:w="120" w:type="dxa"/>
+              <w:bottom w:w="100" w:type="dxa"/>
+              <w:end w:w="120" w:type="dxa"/>
+            </w:tcMar>
+            <w:vAlign w:val="center"/>
+          </w:tcPr>
+          <w:p>
+            <w:pPr>
+              <w:jc w:val="left"/>
+            </w:pPr>
+            <w:r>
+              <w:rPr>
+                <w:rFonts w:ascii="Arial" w:hAnsi="Arial"/>
+                <w:b w:val="0"/>
+                <w:i w:val="0"/>
+                <w:color w:val="000000"/>
+                <w:sz w:val="17"/>
+              </w:rPr>
+              <w:t>Add progressive expansion and export for large automata while keeping compact class labels and legends.</w:t>
+            </w:r>
+          </w:p>
+        </w:tc>
+        <w:tc>
+          <w:tcPr>
+            <w:tcW w:type="dxa" w:w="4392"/>
+            <w:shd w:fill="FFFFFF"/>
+            <w:tcBorders>
+              <w:top w:val="single" w:sz="6" w:color="D9D9D9"/>
+              <w:left w:val="single" w:sz="6" w:color="D9D9D9"/>
+              <w:bottom w:val="single" w:sz="6" w:color="D9D9D9"/>
+              <w:right w:val="single" w:sz="6" w:color="D9D9D9"/>
+              <w:insideH w:val="single" w:sz="6" w:color="D9D9D9"/>
+              <w:insideV w:val="single" w:sz="6" w:color="D9D9D9"/>
+            </w:tcBorders>
+            <w:tcMar>
+              <w:top w:w="100" w:type="dxa"/>
+              <w:start w:w="120" w:type="dxa"/>
+              <w:bottom w:w="100" w:type="dxa"/>
+              <w:end w:w="120" w:type="dxa"/>
+            </w:tcMar>
+            <w:vAlign w:val="center"/>
+          </w:tcPr>
+          <w:p>
+            <w:pPr>
+              <w:jc w:val="left"/>
+            </w:pPr>
+            <w:r>
+              <w:rPr>
+                <w:rFonts w:ascii="Arial" w:hAnsi="Arial"/>
+                <w:b w:val="0"/>
+                <w:i w:val="0"/>
+                <w:color w:val="000000"/>
+                <w:sz w:val="17"/>
+              </w:rPr>
+              <w:t>Large bounded examples remain readable and exported figures preserve the same state and transition meanings.</w:t>
+            </w:r>
+          </w:p>
+        </w:tc>
+      </w:tr>
+    </w:tbl>
+    <w:p>
+      <w:pPr>
+        <w:spacing w:after="40"/>
+      </w:pPr>
+    </w:p>
+    <w:p>
+      <w:pPr>
+        <w:pStyle w:val="Heading1"/>
+        <w:keepNext/>
+      </w:pPr>
+      <w:r>
+        <w:t>10 Conclusion</w:t>
+      </w:r>
+    </w:p>
+    <w:p>
+      <w:pPr>
+        <w:spacing w:after="140" w:line="259" w:lineRule="auto"/>
+      </w:pPr>
+      <w:r>
+        <w:rPr>
+          <w:rFonts w:ascii="Arial" w:hAnsi="Arial"/>
+          <w:b w:val="0"/>
+          <w:i w:val="0"/>
+          <w:color w:val="000000"/>
+          <w:sz w:val="22"/>
+        </w:rPr>
+        <w:t>The project demonstrates the central compiler-design idea that a compact language description can be translated through several precise intermediate representations. A regular expression is parsed into an abstract syntax tree, Thompson construction converts that tree into an epsilon-NFA, subset construction creates DFA states as they are needed, and the resulting automaton decides whether the entire input belongs to the described language.</w:t>
+      </w:r>
+    </w:p>
+    <w:p>
+      <w:pPr>
+        <w:spacing w:after="140" w:line="259" w:lineRule="auto"/>
+      </w:pPr>
+      <w:r>
+        <w:rPr>
+          <w:rFonts w:ascii="Arial" w:hAnsi="Arial"/>
+          <w:b w:val="0"/>
+          <w:i w:val="0"/>
+          <w:color w:val="000000"/>
+          <w:sz w:val="22"/>
+        </w:rPr>
+        <w:t>V2 broadens that pipeline with character classes, bounded repetition, complete-DFA minimization, deterministic simulations, structured diagnostics, reproducible analysis, and a five-tab dashboard. Safety budgets constrain parsing, NFA expansion, lazy-DFA growth, minimization, simulation, and interactive benchmarking. The implementation is therefore useful not only as a matcher but also as an inspectable teaching system for the transformations taught in Compiler Design.</w:t>
+      </w:r>
+    </w:p>
+    <w:p>
+      <w:pPr>
+        <w:spacing w:after="140" w:line="259" w:lineRule="auto"/>
+      </w:pPr>
+      <w:r>
+        <w:rPr>
+          <w:rFonts w:ascii="Arial" w:hAnsi="Arial"/>
+          <w:b w:val="0"/>
+          <w:i w:val="0"/>
+          <w:color w:val="000000"/>
+          <w:sz w:val="22"/>
+        </w:rPr>
+        <w:t>The measured evidence is intentionally balanced. The verified V2 test suite passed, the shared workloads produced the same NFA and explored lazy-DFA state counts as V1, and process peak memory stayed effectively flat; however, V2 core matching was 3.45 to 4.55 times slower on those workloads. The final result is a feature-richer and more explainable engine with a clearly documented optimization target rather than an unsupported claim of universal performance improvement.</w:t>
+      </w:r>
+    </w:p>
+    <w:p>
+      <w:pPr>
+        <w:spacing w:before="80" w:after="160"/>
+      </w:pPr>
+      <w:r>
+        <w:rPr>
+          <w:rFonts w:ascii="Arial" w:hAnsi="Arial"/>
+          <w:b/>
+          <w:i w:val="0"/>
+          <w:color w:val="000000"/>
+          <w:sz w:val="22"/>
+        </w:rPr>
+        <w:t xml:space="preserve">Source code and reproducible project artifacts: </w:t>
+      </w:r>
+      <w:hyperlink r:id="rId10">
+        <w:r>
+          <w:rPr>
+            <w:rFonts w:ascii="Arial" w:hAnsi="Arial"/>
+            <w:color w:val="2E6F9E"/>
+            <w:u w:val="single"/>
+            <w:sz w:val="22"/>
+          </w:rPr>
+          <w:t>https://github.com/shreyyyyy777/compiler_project/tree/feature/v2-regex-engine</w:t>
+        </w:r>
+      </w:hyperlink>
+    </w:p>
     <w:sectPr>
       <w:footerReference w:type="default" r:id="rId9"/>
       <w:pgSz w:w="12240" w:h="15840"/>

</xml_diff>